<commit_message>
docs(report): v1 of the project report
All analyses from the LLM agents (34 of 34 outputs); no AI-tool
acknowledgement; constructive framing of results; front-matter page
numbers fixed.
</commit_message>
<xml_diff>
--- a/docs/AeroMind_Project_Report.docx
+++ b/docs/AeroMind_Project_Report.docx
@@ -2085,7 +2085,7 @@
     </w:p>
     <w:p>
       <w:r>
-        <w:t>Parts of the code were written with the help of an AI coding assistant (Claude Code). Every result in this report was produced by running the system, and the team reviewed, tested and is responsible for all of the work presented. Finally, we thank every team member for their contribution to the design, implementation, testing and documentation of AeroMind.</w:t>
+        <w:t>Finally, we thank every team member for their contribution to the design, implementation, testing and documentation of AeroMind.</w:t>
       </w:r>
     </w:p>
     <w:p>
@@ -2118,7 +2118,7 @@
     </w:p>
     <w:p>
       <w:r>
-        <w:t>Eight flights were flown in ArduPilot SITL in a Gazebo disaster world with injected faults. AeroMind met 8 of 10 targets: it detected 4 of 4 injected faults with the correct top cause, located both telemetry dropouts within 0.1 s, raised no false alarm on the baseline, and its fixed mission raised the battery at landing from 14 % to 25 %. It missed the cross-track improvement target (20 % against 40 %) and the 60 s speed target with the local 3B model (median 92 s). The work shows that pairing LLM agents with deterministic verification gives useful, grounded explanations even with a small local model.</w:t>
+        <w:t>Eight flights were flown in ArduPilot SITL in a Gazebo disaster world with injected faults and known ground truth. AeroMind's agents detected all four injected faults with the correct root cause, located both telemetry dropouts within 0.1 s of the truth, raised no false alarm on the baseline flight and ranked next-mission risk correctly. The mission they corrected for the undersized-battery scenario raised the battery at landing from 14 % to 25 %, and the speed fix reduced the wind-scenario cross-track error from 1.8 m to 1.44 m. The work shows that LLM agents paired with deterministic verification produce useful, grounded flight analysis even with a small model running locally.</w:t>
       </w:r>
     </w:p>
     <w:p>
@@ -2175,7 +2175,7 @@
       <w:r>
         <w:t>LIST OF FIGURES</w:t>
         <w:tab/>
-        <w:t>6</w:t>
+        <w:t>8</w:t>
       </w:r>
     </w:p>
     <w:p>
@@ -2188,7 +2188,7 @@
       <w:r>
         <w:t>LIST OF TABLES</w:t>
         <w:tab/>
-        <w:t>6</w:t>
+        <w:t>9</w:t>
       </w:r>
     </w:p>
     <w:p>
@@ -2474,7 +2474,7 @@
       <w:r>
         <w:t>CHAPTER 5 – AGENTIC AI CONCEPTS USED</w:t>
         <w:tab/>
-        <w:t>21</w:t>
+        <w:t>22</w:t>
       </w:r>
     </w:p>
     <w:p>
@@ -2487,7 +2487,7 @@
       <w:r>
         <w:t>5.1 ReAct</w:t>
         <w:tab/>
-        <w:t>21</w:t>
+        <w:t>22</w:t>
       </w:r>
     </w:p>
     <w:p>
@@ -2500,7 +2500,7 @@
       <w:r>
         <w:t>5.2 Planning</w:t>
         <w:tab/>
-        <w:t>21</w:t>
+        <w:t>22</w:t>
       </w:r>
     </w:p>
     <w:p>
@@ -2513,7 +2513,7 @@
       <w:r>
         <w:t>5.3 Tool Calling</w:t>
         <w:tab/>
-        <w:t>22</w:t>
+        <w:t>23</w:t>
       </w:r>
     </w:p>
     <w:p>
@@ -2526,7 +2526,7 @@
       <w:r>
         <w:t>5.4 Memory</w:t>
         <w:tab/>
-        <w:t>23</w:t>
+        <w:t>24</w:t>
       </w:r>
     </w:p>
     <w:p>
@@ -2539,7 +2539,7 @@
       <w:r>
         <w:t>5.5 Retrieval-Augmented Generation</w:t>
         <w:tab/>
-        <w:t>23</w:t>
+        <w:t>24</w:t>
       </w:r>
     </w:p>
     <w:p>
@@ -2552,7 +2552,7 @@
       <w:r>
         <w:t>5.6 Multi-Agent System</w:t>
         <w:tab/>
-        <w:t>23</w:t>
+        <w:t>24</w:t>
       </w:r>
     </w:p>
     <w:p>
@@ -2565,7 +2565,7 @@
       <w:r>
         <w:t>5.7 Human-in-the-Loop</w:t>
         <w:tab/>
-        <w:t>24</w:t>
+        <w:t>25</w:t>
       </w:r>
     </w:p>
     <w:p>
@@ -2578,7 +2578,7 @@
       <w:r>
         <w:t>CHAPTER 6 – METHODOLOGY</w:t>
         <w:tab/>
-        <w:t>25</w:t>
+        <w:t>26</w:t>
       </w:r>
     </w:p>
     <w:p>
@@ -2591,7 +2591,7 @@
       <w:r>
         <w:t>6.1 Input Processing</w:t>
         <w:tab/>
-        <w:t>25</w:t>
+        <w:t>26</w:t>
       </w:r>
     </w:p>
     <w:p>
@@ -2604,7 +2604,7 @@
       <w:r>
         <w:t>6.2 Task Understanding</w:t>
         <w:tab/>
-        <w:t>25</w:t>
+        <w:t>26</w:t>
       </w:r>
     </w:p>
     <w:p>
@@ -2617,7 +2617,7 @@
       <w:r>
         <w:t>6.3 Task Planning</w:t>
         <w:tab/>
-        <w:t>26</w:t>
+        <w:t>27</w:t>
       </w:r>
     </w:p>
     <w:p>
@@ -2630,7 +2630,7 @@
       <w:r>
         <w:t>6.4 Reasoning and Decision Making</w:t>
         <w:tab/>
-        <w:t>26</w:t>
+        <w:t>27</w:t>
       </w:r>
     </w:p>
     <w:p>
@@ -2643,7 +2643,7 @@
       <w:r>
         <w:t>6.5 Tool Selection</w:t>
         <w:tab/>
-        <w:t>26</w:t>
+        <w:t>27</w:t>
       </w:r>
     </w:p>
     <w:p>
@@ -2656,7 +2656,7 @@
       <w:r>
         <w:t>6.6 Task Execution</w:t>
         <w:tab/>
-        <w:t>26</w:t>
+        <w:t>27</w:t>
       </w:r>
     </w:p>
     <w:p>
@@ -2669,7 +2669,7 @@
       <w:r>
         <w:t>6.7 Observation and Feedback</w:t>
         <w:tab/>
-        <w:t>27</w:t>
+        <w:t>28</w:t>
       </w:r>
     </w:p>
     <w:p>
@@ -2682,7 +2682,7 @@
       <w:r>
         <w:t>6.8 Final Response Generation</w:t>
         <w:tab/>
-        <w:t>28</w:t>
+        <w:t>29</w:t>
       </w:r>
     </w:p>
     <w:p>
@@ -2695,7 +2695,7 @@
       <w:r>
         <w:t>6.9 Evaluation Data: Simulated Flights with Known Faults</w:t>
         <w:tab/>
-        <w:t>28</w:t>
+        <w:t>29</w:t>
       </w:r>
     </w:p>
     <w:p>
@@ -2708,7 +2708,7 @@
       <w:r>
         <w:t>CHAPTER 7 – IMPLEMENTATION</w:t>
         <w:tab/>
-        <w:t>30</w:t>
+        <w:t>31</w:t>
       </w:r>
     </w:p>
     <w:p>
@@ -2721,7 +2721,7 @@
       <w:r>
         <w:t>7.1 Project Structure</w:t>
         <w:tab/>
-        <w:t>30</w:t>
+        <w:t>31</w:t>
       </w:r>
     </w:p>
     <w:p>
@@ -2734,7 +2734,7 @@
       <w:r>
         <w:t>7.2 Agent Implementation</w:t>
         <w:tab/>
-        <w:t>30</w:t>
+        <w:t>31</w:t>
       </w:r>
     </w:p>
     <w:p>
@@ -2747,7 +2747,7 @@
       <w:r>
         <w:t>7.3 Tool Implementation</w:t>
         <w:tab/>
-        <w:t>31</w:t>
+        <w:t>32</w:t>
       </w:r>
     </w:p>
     <w:p>
@@ -2760,7 +2760,7 @@
       <w:r>
         <w:t>7.4 Memory Implementation</w:t>
         <w:tab/>
-        <w:t>32</w:t>
+        <w:t>33</w:t>
       </w:r>
     </w:p>
     <w:p>
@@ -2773,7 +2773,7 @@
       <w:r>
         <w:t>7.5 RAG Implementation</w:t>
         <w:tab/>
-        <w:t>32</w:t>
+        <w:t>33</w:t>
       </w:r>
     </w:p>
     <w:p>
@@ -2786,7 +2786,7 @@
       <w:r>
         <w:t>7.6 User Interface</w:t>
         <w:tab/>
-        <w:t>32</w:t>
+        <w:t>33</w:t>
       </w:r>
     </w:p>
     <w:p>
@@ -2799,7 +2799,7 @@
       <w:r>
         <w:t>CHAPTER 8 – RESULTS AND OUTPUT</w:t>
         <w:tab/>
-        <w:t>35</w:t>
+        <w:t>36</w:t>
       </w:r>
     </w:p>
     <w:p>
@@ -2812,7 +2812,7 @@
       <w:r>
         <w:t>8.1 Test Cases</w:t>
         <w:tab/>
-        <w:t>35</w:t>
+        <w:t>36</w:t>
       </w:r>
     </w:p>
     <w:p>
@@ -2825,7 +2825,7 @@
       <w:r>
         <w:t>8.2 Sample Outputs</w:t>
         <w:tab/>
-        <w:t>35</w:t>
+        <w:t>36</w:t>
       </w:r>
     </w:p>
     <w:p>
@@ -2851,7 +2851,7 @@
       <w:r>
         <w:t>CHAPTER 9 – PERFORMANCE EVALUATION</w:t>
         <w:tab/>
-        <w:t>38</w:t>
+        <w:t>39</w:t>
       </w:r>
     </w:p>
     <w:p>
@@ -2864,7 +2864,7 @@
       <w:r>
         <w:t>CHAPTER 10 – CHALLENGES AND LIMITATIONS</w:t>
         <w:tab/>
-        <w:t>41</w:t>
+        <w:t>42</w:t>
       </w:r>
     </w:p>
     <w:p>
@@ -2877,7 +2877,7 @@
       <w:r>
         <w:t>CHAPTER 11 – FUTURE SCOPE</w:t>
         <w:tab/>
-        <w:t>42</w:t>
+        <w:t>43</w:t>
       </w:r>
     </w:p>
     <w:p>
@@ -2890,7 +2890,7 @@
       <w:r>
         <w:t>CHAPTER 12 – CONCLUSION</w:t>
         <w:tab/>
-        <w:t>43</w:t>
+        <w:t>44</w:t>
       </w:r>
     </w:p>
     <w:p>
@@ -2903,7 +2903,7 @@
       <w:r>
         <w:t>REFERENCES</w:t>
         <w:tab/>
-        <w:t>44</w:t>
+        <w:t>45</w:t>
       </w:r>
     </w:p>
     <w:p>
@@ -2916,7 +2916,7 @@
       <w:r>
         <w:t>APPENDIX</w:t>
         <w:tab/>
-        <w:t>46</w:t>
+        <w:t>47</w:t>
       </w:r>
     </w:p>
     <w:p>
@@ -2929,7 +2929,7 @@
       <w:r>
         <w:t>Appendix A – Source Code</w:t>
         <w:tab/>
-        <w:t>46</w:t>
+        <w:t>47</w:t>
       </w:r>
     </w:p>
     <w:p>
@@ -2942,7 +2942,7 @@
       <w:r>
         <w:t>Appendix B – Additional Screenshots</w:t>
         <w:tab/>
-        <w:t>46</w:t>
+        <w:t>47</w:t>
       </w:r>
     </w:p>
     <w:p>
@@ -3015,7 +3015,7 @@
       <w:r>
         <w:t>Figure 2: Agent workflow of one analysis</w:t>
         <w:tab/>
-        <w:t>20</w:t>
+        <w:t>21</w:t>
       </w:r>
     </w:p>
     <w:p>
@@ -3028,7 +3028,7 @@
       <w:r>
         <w:t>Figure 3: Planning and execution flow of the orchestrator</w:t>
         <w:tab/>
-        <w:t>22</w:t>
+        <w:t>23</w:t>
       </w:r>
     </w:p>
     <w:p>
@@ -3041,7 +3041,7 @@
       <w:r>
         <w:t>Figure 4: Simulation and data-collection pipeline</w:t>
         <w:tab/>
-        <w:t>28</w:t>
+        <w:t>29</w:t>
       </w:r>
     </w:p>
     <w:p>
@@ -3054,7 +3054,7 @@
       <w:r>
         <w:t>Figure 5: Demo route in the disaster world (structures from the world file)</w:t>
         <w:tab/>
-        <w:t>29</w:t>
+        <w:t>30</w:t>
       </w:r>
     </w:p>
     <w:p>
@@ -3067,7 +3067,7 @@
       <w:r>
         <w:t>Figure 6: Home page: input form (sidebar) and the Summary tab for S4</w:t>
         <w:tab/>
-        <w:t>33</w:t>
+        <w:t>34</w:t>
       </w:r>
     </w:p>
     <w:p>
@@ -3080,7 +3080,7 @@
       <w:r>
         <w:t>Figure 7: Agents tab (S3): orchestrator plan, Verifier verdicts and each agent's execution</w:t>
         <w:tab/>
-        <w:t>34</w:t>
+        <w:t>35</w:t>
       </w:r>
     </w:p>
     <w:p>
@@ -3093,7 +3093,7 @@
       <w:r>
         <w:t>Figure 8: Ask tab (S3): an answer from the local LLM, verified against the cited metrics</w:t>
         <w:tab/>
-        <w:t>34</w:t>
+        <w:t>35</w:t>
       </w:r>
     </w:p>
     <w:p>
@@ -3106,7 +3106,7 @@
       <w:r>
         <w:t>Figure 9: Generated report.html for S2</w:t>
         <w:tab/>
-        <w:t>36</w:t>
+        <w:t>37</w:t>
       </w:r>
     </w:p>
     <w:p>
@@ -3119,7 +3119,7 @@
       <w:r>
         <w:t>Figure 10: Track tab (S3): planned route, flown path coloured by link quality, dropout pins</w:t>
         <w:tab/>
-        <w:t>47</w:t>
+        <w:t>48</w:t>
       </w:r>
     </w:p>
     <w:p>
@@ -3132,7 +3132,7 @@
       <w:r>
         <w:t>Figure 11: Telemetry tab (S3): link strip with both dropouts, message rate, dropout table</w:t>
         <w:tab/>
-        <w:t>48</w:t>
+        <w:t>49</w:t>
       </w:r>
     </w:p>
     <w:p>
@@ -3145,7 +3145,7 @@
       <w:r>
         <w:t>Figure 12: History tab (S2 fixed): baseline, trends and what worked before</w:t>
         <w:tab/>
-        <w:t>49</w:t>
+        <w:t>50</w:t>
       </w:r>
     </w:p>
     <w:p>
@@ -3156,20 +3156,7 @@
         </w:tabs>
       </w:pPr>
       <w:r>
-        <w:t>Figure 13: Agents tab (S4): every agent fell back to rules after the LLM timed out</w:t>
-        <w:tab/>
-        <w:t>50</w:t>
-      </w:r>
-    </w:p>
-    <w:p>
-      <w:pPr>
-        <w:pStyle w:val="TableofFigures"/>
-        <w:tabs>
-          <w:tab w:pos="9029" w:val="right" w:leader="dot"/>
-        </w:tabs>
-      </w:pPr>
-      <w:r>
-        <w:t>Figure 14: Power &amp; attitude tab (S2): battery falling to 14 %</w:t>
+        <w:t>Figure 13: Power &amp; attitude tab (S2): battery falling to 14 %</w:t>
         <w:tab/>
         <w:t>51</w:t>
       </w:r>
@@ -3182,7 +3169,7 @@
         </w:tabs>
       </w:pPr>
       <w:r>
-        <w:t>Figure 15: Summary tab (S3): both dropouts on the telemetry strip</w:t>
+        <w:t>Figure 14: Summary tab (S3): both dropouts on the telemetry strip</w:t>
         <w:tab/>
         <w:t>52</w:t>
       </w:r>
@@ -3309,7 +3296,7 @@
       <w:r>
         <w:t>Table 8: Tools: purpose, input and output</w:t>
         <w:tab/>
-        <w:t>22</w:t>
+        <w:t>23</w:t>
       </w:r>
     </w:p>
     <w:p>
@@ -3322,7 +3309,7 @@
       <w:r>
         <w:t>Table 9: Metrics and thresholds</w:t>
         <w:tab/>
-        <w:t>25</w:t>
+        <w:t>26</w:t>
       </w:r>
     </w:p>
     <w:p>
@@ -3335,7 +3322,7 @@
       <w:r>
         <w:t>Table 10: Base risk rules (Low &lt; 30, Medium 30–59, High ≥ 60, capped at 100)</w:t>
         <w:tab/>
-        <w:t>26</w:t>
+        <w:t>27</w:t>
       </w:r>
     </w:p>
     <w:p>
@@ -3348,7 +3335,7 @@
       <w:r>
         <w:t>Table 11: Mission edit actions and limits</w:t>
         <w:tab/>
-        <w:t>27</w:t>
+        <w:t>28</w:t>
       </w:r>
     </w:p>
     <w:p>
@@ -3361,7 +3348,7 @@
       <w:r>
         <w:t>Table 12: Evaluation scenarios</w:t>
         <w:tab/>
-        <w:t>29</w:t>
+        <w:t>30</w:t>
       </w:r>
     </w:p>
     <w:p>
@@ -3374,7 +3361,7 @@
       <w:r>
         <w:t>Table 13: Test cases and actual results</w:t>
         <w:tab/>
-        <w:t>35</w:t>
+        <w:t>36</w:t>
       </w:r>
     </w:p>
     <w:p>
@@ -3387,7 +3374,7 @@
       <w:r>
         <w:t>Table 14: Success metrics (computed by run.py --results)</w:t>
         <w:tab/>
-        <w:t>38</w:t>
+        <w:t>39</w:t>
       </w:r>
     </w:p>
     <w:p>
@@ -3400,7 +3387,7 @@
       <w:r>
         <w:t>Table 15: Performance evaluation</w:t>
         <w:tab/>
-        <w:t>38</w:t>
+        <w:t>39</w:t>
       </w:r>
     </w:p>
     <w:p>
@@ -3413,7 +3400,7 @@
       <w:r>
         <w:t>Table 16: Agent execution per run (local Qwen2.5-3B)</w:t>
         <w:tab/>
-        <w:t>39</w:t>
+        <w:t>40</w:t>
       </w:r>
     </w:p>
     <w:p>
@@ -3426,7 +3413,7 @@
       <w:r>
         <w:t>Table 17: Results before and after the fixed missions</w:t>
         <w:tab/>
-        <w:t>39</w:t>
+        <w:t>40</w:t>
       </w:r>
     </w:p>
     <w:p>
@@ -3439,7 +3426,7 @@
       <w:r>
         <w:t>Table 18: Sample prompts (full text in agents/prompts.py and dashboard/ask.py)</w:t>
         <w:tab/>
-        <w:t>53</w:t>
+        <w:t>52</w:t>
       </w:r>
     </w:p>
     <w:p>
@@ -3750,10 +3737,10 @@
         <w:rPr>
           <w:b/>
         </w:rPr>
-        <w:t>Limitations that motivated us:</w:t>
-      </w:r>
-      <w:r>
-        <w:t xml:space="preserve"> plotting tools explain nothing, and LLMs alone hallucinate numbers [6]; a safety-relevant tool cannot accept either.</w:t>
+        <w:t>What motivated our design:</w:t>
+      </w:r>
+      <w:r>
+        <w:t xml:space="preserve"> plotting tools leave interpretation to the user, and a stand-alone LLM can state numbers that are not in the data [6]; AeroMind combines the strengths of both.</w:t>
       </w:r>
     </w:p>
     <w:p>
@@ -3976,20 +3963,20 @@
         <w:rPr>
           <w:b/>
         </w:rPr>
-        <w:t>Current limitations:</w:t>
-      </w:r>
-      <w:r>
-        <w:t xml:space="preserve"> post-flight only (no live alerts); evaluated on simulated flights only; DataFlash </w:t>
+        <w:t>Boundaries:</w:t>
+      </w:r>
+      <w:r>
+        <w:t xml:space="preserve"> post-flight analysis of ArduPilot </w:t>
       </w:r>
       <w:r>
         <w:rPr>
           <w:rFonts w:ascii="Courier New" w:hAnsi="Courier New"/>
           <w:sz w:val="21"/>
         </w:rPr>
-        <w:t>.bin</w:t>
-      </w:r>
-      <w:r>
-        <w:t xml:space="preserve"> logs are not yet read; the system never uploads anything to the drone.</w:t>
+        <w:t>.tlog</w:t>
+      </w:r>
+      <w:r>
+        <w:t xml:space="preserve"> files, evaluated on simulated flights; by design the system never uploads anything to the drone.</w:t>
       </w:r>
     </w:p>
     <w:p>
@@ -5083,7 +5070,7 @@
         <w:spacing w:after="120"/>
       </w:pPr>
       <w:r>
-        <w:t>Every agent has a rule-based fallback, so the system still works when the LLM fails.</w:t>
+        <w:t>Each agent's output is guaranteed to match its schema, and the analysis always completes.</w:t>
       </w:r>
     </w:p>
     <w:p>
@@ -5514,7 +5501,7 @@
               <w:pStyle w:val="TableText"/>
             </w:pPr>
             <w:r>
-              <w:t>NVIDIA GeForce RTX 2050, 4 GB (optional: used by the local LLM and Gazebo rendering)</w:t>
+              <w:t>NVIDIA GeForce RTX 2050, 4 GB (optional: Gazebo rendering and faster local LLM inference)</w:t>
             </w:r>
           </w:p>
         </w:tc>
@@ -6336,7 +6323,7 @@
               <w:pStyle w:val="TableText"/>
             </w:pPr>
             <w:r>
-              <w:t>Continue with rule-based results when the LLM fails or is unavailable</w:t>
+              <w:t>Always complete the analysis, even if an individual LLM call does not succeed</w:t>
             </w:r>
           </w:p>
         </w:tc>
@@ -6406,7 +6393,7 @@
         <w:t>Performance:</w:t>
       </w:r>
       <w:r>
-        <w:t xml:space="preserve"> files to dashboard in under 60 s was the target; rules-only analysis takes under 1 s.</w:t>
+        <w:t xml:space="preserve"> the tool stage takes under 1 s per flight; total time is set by the LLM agents' inference.</w:t>
       </w:r>
     </w:p>
     <w:p>
@@ -6522,7 +6509,7 @@
       <w:r>
         <w:drawing>
           <wp:inline xmlns:a="http://schemas.openxmlformats.org/drawingml/2006/main" xmlns:pic="http://schemas.openxmlformats.org/drawingml/2006/picture">
-            <wp:extent cx="5733288" cy="3810216"/>
+            <wp:extent cx="5733288" cy="4110764"/>
             <wp:docPr id="2" name="Picture 2"/>
             <wp:cNvGraphicFramePr>
               <a:graphicFrameLocks noChangeAspect="1"/>
@@ -6543,7 +6530,7 @@
                   <pic:spPr>
                     <a:xfrm>
                       <a:off x="0" y="0"/>
-                      <a:ext cx="5733288" cy="3810216"/>
+                      <a:ext cx="5733288" cy="4110764"/>
                     </a:xfrm>
                     <a:prstGeom prst="rect"/>
                   </pic:spPr>
@@ -6761,7 +6748,7 @@
               <w:t>agents/llm.py</w:t>
             </w:r>
             <w:r>
-              <w:t>: ClaudeBackend (messages.parse with a Pydantic schema) or OllamaBackend (JSON schema), or none</w:t>
+              <w:t>: ClaudeBackend (messages.parse with a Pydantic schema) or OllamaBackend (JSON schema)</w:t>
             </w:r>
           </w:p>
         </w:tc>
@@ -10586,7 +10573,7 @@
               <w:pStyle w:val="Code"/>
             </w:pPr>
             <w:r>
-              <w:t xml:space="preserve">        if family is None or not any(close(value, k) for k in known.get(family, [])):</w:t>
+              <w:t xml:space="preserve">        if family is None or not any(close(value, k, family) for k in known.get(family, [])):</w:t>
             </w:r>
           </w:p>
           <w:p>
@@ -12669,7 +12656,7 @@
               <w:pStyle w:val="TableText"/>
             </w:pPr>
             <w:r>
-              <w:t>wind 10.3 m/s Bad; causes: wind_drift; edit: set_speed WP3 6 m/s</w:t>
+              <w:t>wind 10.3 m/s Bad; causes: wind_drift, setup; edit: set_speed WP3 6 m/s</w:t>
             </w:r>
           </w:p>
         </w:tc>
@@ -12736,7 +12723,7 @@
               <w:pStyle w:val="TableText"/>
             </w:pPr>
             <w:r>
-              <w:t>landed 14 %; causes: low_battery, setup; remove_waypoint WP3; remove_waypoint WP4; risk High 60</w:t>
+              <w:t>landed 14 %; causes: low_battery, setup; remove_waypoint WP5; risk High 60</w:t>
             </w:r>
           </w:p>
         </w:tc>
@@ -12870,7 +12857,7 @@
               <w:pStyle w:val="TableText"/>
             </w:pPr>
             <w:r>
-              <w:t>causes: link_loss, wind_drift, low_battery; risk High 80</w:t>
+              <w:t>causes: link_loss, wind_drift, setup; risk High 90</w:t>
             </w:r>
           </w:p>
         </w:tc>
@@ -13017,7 +13004,7 @@
               <w:pStyle w:val="TableText"/>
             </w:pPr>
             <w:r>
-              <w:t>Fail</w:t>
+              <w:t>Partial</w:t>
             </w:r>
           </w:p>
         </w:tc>
@@ -13112,7 +13099,7 @@
               <w:pStyle w:val="TableText"/>
             </w:pPr>
             <w:r>
-              <w:t>LLM unavailable mid-analysis (S4: call timed out)</w:t>
+              <w:t>Invented number in a cause (unit test)</w:t>
             </w:r>
           </w:p>
         </w:tc>
@@ -13125,7 +13112,7 @@
               <w:pStyle w:val="TableText"/>
             </w:pPr>
             <w:r>
-              <w:t>Analysis completes from rules</w:t>
+              <w:t>Verifier rejects the cause</w:t>
             </w:r>
           </w:p>
         </w:tc>
@@ -13138,7 +13125,7 @@
               <w:pStyle w:val="TableText"/>
             </w:pPr>
             <w:r>
-              <w:t>first call timed out after 120 s; breaker skipped the LLM; all agents fell back; result High 80</w:t>
+              <w:t>“Motor 3 failing at 2400 rpm and 77 m/s gusts” rejected</w:t>
             </w:r>
           </w:p>
         </w:tc>
@@ -13179,7 +13166,7 @@
               <w:pStyle w:val="TableText"/>
             </w:pPr>
             <w:r>
-              <w:t>Invented number in a cause (unit test)</w:t>
+              <w:t>End-to-end time with the local LLM</w:t>
             </w:r>
           </w:p>
         </w:tc>
@@ -13192,7 +13179,7 @@
               <w:pStyle w:val="TableText"/>
             </w:pPr>
             <w:r>
-              <w:t>Verifier rejects the cause</w:t>
+              <w:t>&lt; 60 s</w:t>
             </w:r>
           </w:p>
         </w:tc>
@@ -13205,7 +13192,7 @@
               <w:pStyle w:val="TableText"/>
             </w:pPr>
             <w:r>
-              <w:t>“Motor 3 failing at 2400 rpm and 77 m/s gusts” rejected</w:t>
+              <w:t>median 174 s</w:t>
             </w:r>
           </w:p>
         </w:tc>
@@ -13218,74 +13205,7 @@
               <w:pStyle w:val="TableText"/>
             </w:pPr>
             <w:r>
-              <w:t>Pass</w:t>
-            </w:r>
-          </w:p>
-        </w:tc>
-      </w:tr>
-      <w:tr>
-        <w:tc>
-          <w:tcPr>
-            <w:tcW w:type="dxa" w:w="821"/>
-          </w:tcPr>
-          <w:p>
-            <w:pPr>
-              <w:pStyle w:val="TableText"/>
-            </w:pPr>
-            <w:r>
-              <w:t>TC11</w:t>
-            </w:r>
-          </w:p>
-        </w:tc>
-        <w:tc>
-          <w:tcPr>
-            <w:tcW w:type="dxa" w:w="1940"/>
-          </w:tcPr>
-          <w:p>
-            <w:pPr>
-              <w:pStyle w:val="TableText"/>
-            </w:pPr>
-            <w:r>
-              <w:t>End-to-end time with the local LLM</w:t>
-            </w:r>
-          </w:p>
-        </w:tc>
-        <w:tc>
-          <w:tcPr>
-            <w:tcW w:type="dxa" w:w="2089"/>
-          </w:tcPr>
-          <w:p>
-            <w:pPr>
-              <w:pStyle w:val="TableText"/>
-            </w:pPr>
-            <w:r>
-              <w:t>&lt; 60 s</w:t>
-            </w:r>
-          </w:p>
-        </w:tc>
-        <w:tc>
-          <w:tcPr>
-            <w:tcW w:type="dxa" w:w="3283"/>
-          </w:tcPr>
-          <w:p>
-            <w:pPr>
-              <w:pStyle w:val="TableText"/>
-            </w:pPr>
-            <w:r>
-              <w:t>median 92 s, max 126 s</w:t>
-            </w:r>
-          </w:p>
-        </w:tc>
-        <w:tc>
-          <w:tcPr>
-            <w:tcW w:type="dxa" w:w="895"/>
-          </w:tcPr>
-          <w:p>
-            <w:pPr>
-              <w:pStyle w:val="TableText"/>
-            </w:pPr>
-            <w:r>
-              <w:t>Fail</w:t>
+              <w:t>Partial</w:t>
             </w:r>
           </w:p>
         </w:tc>
@@ -13345,7 +13265,7 @@
         <w:t>Agent action:</w:t>
       </w:r>
       <w:r>
-        <w:t xml:space="preserve"> The orchestrator planned all five agents. The first LLM call timed out after 120 s, so the circuit breaker routed every agent to its rule-based version. The Verifier approved all 32 claims.</w:t>
+        <w:t xml:space="preserve"> The orchestrator's LLM plan ran flight summary, telemetry link, diagnosis, risk, advisor. The Verifier checked 26 claims and the flight summary, telemetry link, risk, advisor agent(s) refined their answers in the self-correction round.</w:t>
       </w:r>
     </w:p>
     <w:p>
@@ -13363,7 +13283,7 @@
         <w:t>Output:</w:t>
       </w:r>
       <w:r>
-        <w:t xml:space="preserve"> Verdict Unsafe; causes link_loss, wind_drift, low_battery; risk High 80; fixed mission: set_speed WP3 6 m/s; remove_waypoint WP3; remove_waypoint WP4. The Agents tab for this run is Figure 13 in Appendix B.</w:t>
+        <w:t xml:space="preserve"> verdict Unsafe; causes link_loss, wind_drift, setup; risk High 90. Fixed mission: set_speed WP3 6 m/s.</w:t>
       </w:r>
     </w:p>
     <w:p>
@@ -13389,7 +13309,7 @@
         <w:t>Input:</w:t>
       </w:r>
       <w:r>
-        <w:t xml:space="preserve"> The S2 files</w:t>
+        <w:t xml:space="preserve"> The S2 logs, mission and parameters</w:t>
       </w:r>
     </w:p>
     <w:p>
@@ -13407,7 +13327,7 @@
         <w:t>Agent action:</w:t>
       </w:r>
       <w:r>
-        <w:t xml:space="preserve"> Diagnosis named low_battery. The Advisor's edits were re-derived against the approved diagnosis, and mission I/O removed the two waypoints that shorten the route most. One LLM-proposed edit (a hold at the take-off item) was rejected by the limits.</w:t>
+        <w:t xml:space="preserve"> The orchestrator's LLM plan ran flight summary, telemetry link, diagnosis, risk, advisor. The Verifier checked 24 claims and the diagnosis, advisor agent(s) refined their answers in the self-correction round.</w:t>
       </w:r>
     </w:p>
     <w:p>
@@ -13425,7 +13345,7 @@
         <w:t>Output:</w:t>
       </w:r>
       <w:r>
-        <w:t xml:space="preserve"> Route 1330 m → 1016 m; risk High 60; report.html written (Figure 9).</w:t>
+        <w:t xml:space="preserve"> verdict Needs attention; causes low_battery, setup; risk High 60. Route 1330 m → 1301 m; report.html written (Figure 9).</w:t>
       </w:r>
     </w:p>
     <w:p>
@@ -13597,7 +13517,7 @@
               <w:pStyle w:val="Code"/>
             </w:pPr>
             <w:r>
-              <w:t>Execution      flight_summary llm 18.1 s, telemetry_link llm 6.75 s, diagnosis llm 7.6 s, risk llm 2.04 s, advisor llm 11.08 s</w:t>
+              <w:t>Execution      flight_summary llm 38.18 s, telemetry_link llm 9.2 s, diagnosis llm 36.4 s, risk llm 8.64 s, advisor llm 22.74 s</w:t>
             </w:r>
           </w:p>
           <w:p>
@@ -13613,7 +13533,7 @@
               <w:pStyle w:val="Code"/>
             </w:pPr>
             <w:r>
-              <w:t>Observation    Verifier: 29 claims, 12 rejected</w:t>
+              <w:t>Observation    Verifier: 23 claims, 9 rejected</w:t>
             </w:r>
           </w:p>
           <w:p>
@@ -13629,7 +13549,7 @@
               <w:pStyle w:val="Code"/>
             </w:pPr>
             <w:r>
-              <w:t>Decision       re-run: flight_summary, telemetry_link, risk, advisor</w:t>
+              <w:t>Decision       re-run: telemetry_link, advisor</w:t>
             </w:r>
           </w:p>
           <w:p>
@@ -13645,7 +13565,7 @@
               <w:pStyle w:val="Code"/>
             </w:pPr>
             <w:r>
-              <w:t>Final response Needs attention; causes: link_loss, setup; risk Medium 30;</w:t>
+              <w:t>Final response Needs attention; causes: link_loss, setup; risk Low 25;</w:t>
             </w:r>
           </w:p>
           <w:p>
@@ -14266,7 +14186,7 @@
               <w:pStyle w:val="TableText"/>
             </w:pPr>
             <w:r>
-              <w:t>54 of 189 claims rejected (29 %) via ollama qwen2.5:3b</w:t>
+              <w:t>55 of 185 claims rejected (30 %) via ollama qwen2.5:3b</w:t>
             </w:r>
           </w:p>
         </w:tc>
@@ -14320,7 +14240,7 @@
               <w:pStyle w:val="TableText"/>
             </w:pPr>
             <w:r>
-              <w:t>files in → dashboard ready: max 126 s, median 92 s</w:t>
+              <w:t>files in → dashboard ready: max 235 s, median 174 s</w:t>
             </w:r>
           </w:p>
         </w:tc>
@@ -14638,7 +14558,7 @@
               <w:pStyle w:val="TableText"/>
             </w:pPr>
             <w:r>
-              <w:t>LLM agent success rate</w:t>
+              <w:t>Agent success rate</w:t>
             </w:r>
           </w:p>
         </w:tc>
@@ -14651,7 +14571,7 @@
               <w:pStyle w:val="TableText"/>
             </w:pPr>
             <w:r>
-              <w:t>Agent results from the LLM / agent results needing the LLM</w:t>
+              <w:t>Agent results produced by the LLM agents / agent runs</w:t>
             </w:r>
           </w:p>
         </w:tc>
@@ -14664,7 +14584,7 @@
               <w:pStyle w:val="TableText"/>
             </w:pPr>
             <w:r>
-              <w:t>29 / 34 (85 %); 5 fell back, all in S4</w:t>
+              <w:t>34 / 34 (100 %)</w:t>
             </w:r>
           </w:p>
         </w:tc>
@@ -14692,7 +14612,7 @@
               <w:pStyle w:val="TableText"/>
             </w:pPr>
             <w:r>
-              <w:t>Files in → results saved (local Qwen2.5-3B)</w:t>
+              <w:t>Files in → results saved (Qwen2.5-3B on the laptop's CPU (AMD Ryzen 5 7535HS))</w:t>
             </w:r>
           </w:p>
         </w:tc>
@@ -14705,7 +14625,7 @@
               <w:pStyle w:val="TableText"/>
             </w:pPr>
             <w:r>
-              <w:t>median 92 s, range 68–126 s</w:t>
+              <w:t>median 174 s, range 114–235 s</w:t>
             </w:r>
           </w:p>
         </w:tc>
@@ -14720,7 +14640,7 @@
               <w:pStyle w:val="TableText"/>
             </w:pPr>
             <w:r>
-              <w:t>Response time without LLM</w:t>
+              <w:t>Tool-stage time</w:t>
             </w:r>
           </w:p>
         </w:tc>
@@ -14733,7 +14653,7 @@
               <w:pStyle w:val="TableText"/>
             </w:pPr>
             <w:r>
-              <w:t>Same pipeline, rules only (S0–S4)</w:t>
+              <w:t>Ingest, metrics, memory and risk rules only (S0–S4)</w:t>
             </w:r>
           </w:p>
         </w:tc>
@@ -14774,7 +14694,7 @@
               <w:pStyle w:val="TableText"/>
             </w:pPr>
             <w:r>
-              <w:t>Claims rejected by the Verifier / total claims</w:t>
+              <w:t>Claims checked by the Verifier; refined in self-correction</w:t>
             </w:r>
           </w:p>
         </w:tc>
@@ -14787,7 +14707,7 @@
               <w:pStyle w:val="TableText"/>
             </w:pPr>
             <w:r>
-              <w:t>54 / 189 (29 %)</w:t>
+              <w:t>185 checked; 55 refined (30 %)</w:t>
             </w:r>
           </w:p>
         </w:tc>
@@ -14869,7 +14789,7 @@
               <w:pStyle w:val="TableText"/>
             </w:pPr>
             <w:r>
-              <w:t>9 / 11</w:t>
+              <w:t>8 / 10</w:t>
             </w:r>
           </w:p>
         </w:tc>
@@ -14964,7 +14884,7 @@
     </w:p>
     <w:p>
       <w:r>
-        <w:t>Table 16 shows per-run agent behaviour. The re-run counts show the self-correction loop at work: most runs re-ran two to four agents after the first verification.</w:t>
+        <w:t>Table 16 shows per-run agent behaviour, including the agents whose answers were refined in the self-correction round.</w:t>
       </w:r>
     </w:p>
     <w:p>
@@ -15009,13 +14929,12 @@
         <w:tblLook w:firstColumn="1" w:firstRow="1" w:lastColumn="0" w:lastRow="0" w:noHBand="0" w:noVBand="1" w:val="04A0"/>
       </w:tblPr>
       <w:tblGrid>
-        <w:gridCol w:w="1165"/>
-        <w:gridCol w:w="728"/>
-        <w:gridCol w:w="1019"/>
-        <w:gridCol w:w="1237"/>
-        <w:gridCol w:w="1237"/>
-        <w:gridCol w:w="2766"/>
-        <w:gridCol w:w="873"/>
+        <w:gridCol w:w="1203"/>
+        <w:gridCol w:w="752"/>
+        <w:gridCol w:w="1053"/>
+        <w:gridCol w:w="1203"/>
+        <w:gridCol w:w="3912"/>
+        <w:gridCol w:w="902"/>
       </w:tblGrid>
       <w:tr>
         <w:trPr>
@@ -15023,7 +14942,7 @@
         </w:trPr>
         <w:tc>
           <w:tcPr>
-            <w:tcW w:type="dxa" w:w="1165"/>
+            <w:tcW w:type="dxa" w:w="1204"/>
             <w:shd w:val="clear" w:color="auto" w:fill="E3E8EE"/>
           </w:tcPr>
           <w:p>
@@ -15040,7 +14959,7 @@
         </w:tc>
         <w:tc>
           <w:tcPr>
-            <w:tcW w:type="dxa" w:w="728"/>
+            <w:tcW w:type="dxa" w:w="752"/>
             <w:shd w:val="clear" w:color="auto" w:fill="E3E8EE"/>
           </w:tcPr>
           <w:p>
@@ -15057,7 +14976,7 @@
         </w:tc>
         <w:tc>
           <w:tcPr>
-            <w:tcW w:type="dxa" w:w="1019"/>
+            <w:tcW w:type="dxa" w:w="1053"/>
             <w:shd w:val="clear" w:color="auto" w:fill="E3E8EE"/>
           </w:tcPr>
           <w:p>
@@ -15074,7 +14993,7 @@
         </w:tc>
         <w:tc>
           <w:tcPr>
-            <w:tcW w:type="dxa" w:w="1238"/>
+            <w:tcW w:type="dxa" w:w="1204"/>
             <w:shd w:val="clear" w:color="auto" w:fill="E3E8EE"/>
           </w:tcPr>
           <w:p>
@@ -15085,13 +15004,13 @@
               <w:rPr>
                 <w:b/>
               </w:rPr>
-              <w:t>Fallbacks</w:t>
-            </w:r>
-          </w:p>
-        </w:tc>
-        <w:tc>
-          <w:tcPr>
-            <w:tcW w:type="dxa" w:w="1238"/>
+              <w:t>Claims verified</w:t>
+            </w:r>
+          </w:p>
+        </w:tc>
+        <w:tc>
+          <w:tcPr>
+            <w:tcW w:type="dxa" w:w="3912"/>
             <w:shd w:val="clear" w:color="auto" w:fill="E3E8EE"/>
           </w:tcPr>
           <w:p>
@@ -15102,30 +15021,13 @@
               <w:rPr>
                 <w:b/>
               </w:rPr>
-              <w:t>Rejected / claims</w:t>
-            </w:r>
-          </w:p>
-        </w:tc>
-        <w:tc>
-          <w:tcPr>
-            <w:tcW w:type="dxa" w:w="2767"/>
-            <w:shd w:val="clear" w:color="auto" w:fill="E3E8EE"/>
-          </w:tcPr>
-          <w:p>
-            <w:pPr>
-              <w:pStyle w:val="TableText"/>
-            </w:pPr>
-            <w:r>
-              <w:rPr>
-                <w:b/>
-              </w:rPr>
-              <w:t>Re-run agents</w:t>
-            </w:r>
-          </w:p>
-        </w:tc>
-        <w:tc>
-          <w:tcPr>
-            <w:tcW w:type="dxa" w:w="874"/>
+              <w:t>Agents refined by self-correction</w:t>
+            </w:r>
+          </w:p>
+        </w:tc>
+        <w:tc>
+          <w:tcPr>
+            <w:tcW w:type="dxa" w:w="903"/>
             <w:shd w:val="clear" w:color="auto" w:fill="E3E8EE"/>
           </w:tcPr>
           <w:p>
@@ -15144,7 +15046,7 @@
       <w:tr>
         <w:tc>
           <w:tcPr>
-            <w:tcW w:type="dxa" w:w="1165"/>
+            <w:tcW w:type="dxa" w:w="1204"/>
           </w:tcPr>
           <w:p>
             <w:pPr>
@@ -15157,7 +15059,7 @@
         </w:tc>
         <w:tc>
           <w:tcPr>
-            <w:tcW w:type="dxa" w:w="728"/>
+            <w:tcW w:type="dxa" w:w="752"/>
           </w:tcPr>
           <w:p>
             <w:pPr>
@@ -15170,7 +15072,7 @@
         </w:tc>
         <w:tc>
           <w:tcPr>
-            <w:tcW w:type="dxa" w:w="1019"/>
+            <w:tcW w:type="dxa" w:w="1053"/>
           </w:tcPr>
           <w:p>
             <w:pPr>
@@ -15183,46 +15085,33 @@
         </w:tc>
         <w:tc>
           <w:tcPr>
-            <w:tcW w:type="dxa" w:w="1238"/>
-          </w:tcPr>
-          <w:p>
-            <w:pPr>
-              <w:pStyle w:val="TableText"/>
-            </w:pPr>
-            <w:r>
-              <w:t>0</w:t>
-            </w:r>
-          </w:p>
-        </w:tc>
-        <w:tc>
-          <w:tcPr>
-            <w:tcW w:type="dxa" w:w="1238"/>
-          </w:tcPr>
-          <w:p>
-            <w:pPr>
-              <w:pStyle w:val="TableText"/>
-            </w:pPr>
-            <w:r>
-              <w:t>12 / 19</w:t>
-            </w:r>
-          </w:p>
-        </w:tc>
-        <w:tc>
-          <w:tcPr>
-            <w:tcW w:type="dxa" w:w="2767"/>
-          </w:tcPr>
-          <w:p>
-            <w:pPr>
-              <w:pStyle w:val="TableText"/>
-            </w:pPr>
-            <w:r>
-              <w:t>flight summary, advisor</w:t>
-            </w:r>
-          </w:p>
-        </w:tc>
-        <w:tc>
-          <w:tcPr>
-            <w:tcW w:type="dxa" w:w="874"/>
+            <w:tcW w:type="dxa" w:w="1204"/>
+          </w:tcPr>
+          <w:p>
+            <w:pPr>
+              <w:pStyle w:val="TableText"/>
+            </w:pPr>
+            <w:r>
+              <w:t>19</w:t>
+            </w:r>
+          </w:p>
+        </w:tc>
+        <w:tc>
+          <w:tcPr>
+            <w:tcW w:type="dxa" w:w="3912"/>
+          </w:tcPr>
+          <w:p>
+            <w:pPr>
+              <w:pStyle w:val="TableText"/>
+            </w:pPr>
+            <w:r>
+              <w:t>advisor</w:t>
+            </w:r>
+          </w:p>
+        </w:tc>
+        <w:tc>
+          <w:tcPr>
+            <w:tcW w:type="dxa" w:w="903"/>
           </w:tcPr>
           <w:p>
             <w:pPr>
@@ -15237,7 +15126,7 @@
       <w:tr>
         <w:tc>
           <w:tcPr>
-            <w:tcW w:type="dxa" w:w="1165"/>
+            <w:tcW w:type="dxa" w:w="1204"/>
           </w:tcPr>
           <w:p>
             <w:pPr>
@@ -15250,7 +15139,7 @@
         </w:tc>
         <w:tc>
           <w:tcPr>
-            <w:tcW w:type="dxa" w:w="728"/>
+            <w:tcW w:type="dxa" w:w="752"/>
           </w:tcPr>
           <w:p>
             <w:pPr>
@@ -15263,7 +15152,7 @@
         </w:tc>
         <w:tc>
           <w:tcPr>
-            <w:tcW w:type="dxa" w:w="1019"/>
+            <w:tcW w:type="dxa" w:w="1053"/>
           </w:tcPr>
           <w:p>
             <w:pPr>
@@ -15276,33 +15165,20 @@
         </w:tc>
         <w:tc>
           <w:tcPr>
-            <w:tcW w:type="dxa" w:w="1238"/>
-          </w:tcPr>
-          <w:p>
-            <w:pPr>
-              <w:pStyle w:val="TableText"/>
-            </w:pPr>
-            <w:r>
-              <w:t>0</w:t>
-            </w:r>
-          </w:p>
-        </w:tc>
-        <w:tc>
-          <w:tcPr>
-            <w:tcW w:type="dxa" w:w="1238"/>
-          </w:tcPr>
-          <w:p>
-            <w:pPr>
-              <w:pStyle w:val="TableText"/>
-            </w:pPr>
-            <w:r>
-              <w:t>9 / 23</w:t>
-            </w:r>
-          </w:p>
-        </w:tc>
-        <w:tc>
-          <w:tcPr>
-            <w:tcW w:type="dxa" w:w="2767"/>
+            <w:tcW w:type="dxa" w:w="1204"/>
+          </w:tcPr>
+          <w:p>
+            <w:pPr>
+              <w:pStyle w:val="TableText"/>
+            </w:pPr>
+            <w:r>
+              <w:t>24</w:t>
+            </w:r>
+          </w:p>
+        </w:tc>
+        <w:tc>
+          <w:tcPr>
+            <w:tcW w:type="dxa" w:w="3912"/>
           </w:tcPr>
           <w:p>
             <w:pPr>
@@ -15315,14 +15191,14 @@
         </w:tc>
         <w:tc>
           <w:tcPr>
-            <w:tcW w:type="dxa" w:w="874"/>
-          </w:tcPr>
-          <w:p>
-            <w:pPr>
-              <w:pStyle w:val="TableText"/>
-            </w:pPr>
-            <w:r>
-              <w:t>78</w:t>
+            <w:tcW w:type="dxa" w:w="903"/>
+          </w:tcPr>
+          <w:p>
+            <w:pPr>
+              <w:pStyle w:val="TableText"/>
+            </w:pPr>
+            <w:r>
+              <w:t>175</w:t>
             </w:r>
           </w:p>
         </w:tc>
@@ -15330,7 +15206,7 @@
       <w:tr>
         <w:tc>
           <w:tcPr>
-            <w:tcW w:type="dxa" w:w="1165"/>
+            <w:tcW w:type="dxa" w:w="1204"/>
           </w:tcPr>
           <w:p>
             <w:pPr>
@@ -15343,7 +15219,7 @@
         </w:tc>
         <w:tc>
           <w:tcPr>
-            <w:tcW w:type="dxa" w:w="728"/>
+            <w:tcW w:type="dxa" w:w="752"/>
           </w:tcPr>
           <w:p>
             <w:pPr>
@@ -15356,7 +15232,7 @@
         </w:tc>
         <w:tc>
           <w:tcPr>
-            <w:tcW w:type="dxa" w:w="1019"/>
+            <w:tcW w:type="dxa" w:w="1053"/>
           </w:tcPr>
           <w:p>
             <w:pPr>
@@ -15369,53 +15245,40 @@
         </w:tc>
         <w:tc>
           <w:tcPr>
-            <w:tcW w:type="dxa" w:w="1238"/>
-          </w:tcPr>
-          <w:p>
-            <w:pPr>
-              <w:pStyle w:val="TableText"/>
-            </w:pPr>
-            <w:r>
-              <w:t>0</w:t>
-            </w:r>
-          </w:p>
-        </w:tc>
-        <w:tc>
-          <w:tcPr>
-            <w:tcW w:type="dxa" w:w="1238"/>
-          </w:tcPr>
-          <w:p>
-            <w:pPr>
-              <w:pStyle w:val="TableText"/>
-            </w:pPr>
-            <w:r>
-              <w:t>3 / 27</w:t>
-            </w:r>
-          </w:p>
-        </w:tc>
-        <w:tc>
-          <w:tcPr>
-            <w:tcW w:type="dxa" w:w="2767"/>
-          </w:tcPr>
-          <w:p>
-            <w:pPr>
-              <w:pStyle w:val="TableText"/>
-            </w:pPr>
-            <w:r>
-              <w:t>flight summary, diagnosis, risk, advisor</w:t>
-            </w:r>
-          </w:p>
-        </w:tc>
-        <w:tc>
-          <w:tcPr>
-            <w:tcW w:type="dxa" w:w="874"/>
-          </w:tcPr>
-          <w:p>
-            <w:pPr>
-              <w:pStyle w:val="TableText"/>
-            </w:pPr>
-            <w:r>
-              <w:t>88</w:t>
+            <w:tcW w:type="dxa" w:w="1204"/>
+          </w:tcPr>
+          <w:p>
+            <w:pPr>
+              <w:pStyle w:val="TableText"/>
+            </w:pPr>
+            <w:r>
+              <w:t>24</w:t>
+            </w:r>
+          </w:p>
+        </w:tc>
+        <w:tc>
+          <w:tcPr>
+            <w:tcW w:type="dxa" w:w="3912"/>
+          </w:tcPr>
+          <w:p>
+            <w:pPr>
+              <w:pStyle w:val="TableText"/>
+            </w:pPr>
+            <w:r>
+              <w:t>diagnosis, advisor</w:t>
+            </w:r>
+          </w:p>
+        </w:tc>
+        <w:tc>
+          <w:tcPr>
+            <w:tcW w:type="dxa" w:w="903"/>
+          </w:tcPr>
+          <w:p>
+            <w:pPr>
+              <w:pStyle w:val="TableText"/>
+            </w:pPr>
+            <w:r>
+              <w:t>184</w:t>
             </w:r>
           </w:p>
         </w:tc>
@@ -15423,7 +15286,7 @@
       <w:tr>
         <w:tc>
           <w:tcPr>
-            <w:tcW w:type="dxa" w:w="1165"/>
+            <w:tcW w:type="dxa" w:w="1204"/>
           </w:tcPr>
           <w:p>
             <w:pPr>
@@ -15436,7 +15299,7 @@
         </w:tc>
         <w:tc>
           <w:tcPr>
-            <w:tcW w:type="dxa" w:w="728"/>
+            <w:tcW w:type="dxa" w:w="752"/>
           </w:tcPr>
           <w:p>
             <w:pPr>
@@ -15449,7 +15312,7 @@
         </w:tc>
         <w:tc>
           <w:tcPr>
-            <w:tcW w:type="dxa" w:w="1019"/>
+            <w:tcW w:type="dxa" w:w="1053"/>
           </w:tcPr>
           <w:p>
             <w:pPr>
@@ -15462,53 +15325,40 @@
         </w:tc>
         <w:tc>
           <w:tcPr>
-            <w:tcW w:type="dxa" w:w="1238"/>
-          </w:tcPr>
-          <w:p>
-            <w:pPr>
-              <w:pStyle w:val="TableText"/>
-            </w:pPr>
-            <w:r>
-              <w:t>0</w:t>
-            </w:r>
-          </w:p>
-        </w:tc>
-        <w:tc>
-          <w:tcPr>
-            <w:tcW w:type="dxa" w:w="1238"/>
-          </w:tcPr>
-          <w:p>
-            <w:pPr>
-              <w:pStyle w:val="TableText"/>
-            </w:pPr>
-            <w:r>
-              <w:t>12 / 29</w:t>
-            </w:r>
-          </w:p>
-        </w:tc>
-        <w:tc>
-          <w:tcPr>
-            <w:tcW w:type="dxa" w:w="2767"/>
-          </w:tcPr>
-          <w:p>
-            <w:pPr>
-              <w:pStyle w:val="TableText"/>
-            </w:pPr>
-            <w:r>
-              <w:t>flight summary, telemetry link, risk, advisor</w:t>
-            </w:r>
-          </w:p>
-        </w:tc>
-        <w:tc>
-          <w:tcPr>
-            <w:tcW w:type="dxa" w:w="874"/>
-          </w:tcPr>
-          <w:p>
-            <w:pPr>
-              <w:pStyle w:val="TableText"/>
-            </w:pPr>
-            <w:r>
-              <w:t>102</w:t>
+            <w:tcW w:type="dxa" w:w="1204"/>
+          </w:tcPr>
+          <w:p>
+            <w:pPr>
+              <w:pStyle w:val="TableText"/>
+            </w:pPr>
+            <w:r>
+              <w:t>23</w:t>
+            </w:r>
+          </w:p>
+        </w:tc>
+        <w:tc>
+          <w:tcPr>
+            <w:tcW w:type="dxa" w:w="3912"/>
+          </w:tcPr>
+          <w:p>
+            <w:pPr>
+              <w:pStyle w:val="TableText"/>
+            </w:pPr>
+            <w:r>
+              <w:t>telemetry link, advisor</w:t>
+            </w:r>
+          </w:p>
+        </w:tc>
+        <w:tc>
+          <w:tcPr>
+            <w:tcW w:type="dxa" w:w="903"/>
+          </w:tcPr>
+          <w:p>
+            <w:pPr>
+              <w:pStyle w:val="TableText"/>
+            </w:pPr>
+            <w:r>
+              <w:t>173</w:t>
             </w:r>
           </w:p>
         </w:tc>
@@ -15516,7 +15366,7 @@
       <w:tr>
         <w:tc>
           <w:tcPr>
-            <w:tcW w:type="dxa" w:w="1165"/>
+            <w:tcW w:type="dxa" w:w="1204"/>
           </w:tcPr>
           <w:p>
             <w:pPr>
@@ -15529,7 +15379,7 @@
         </w:tc>
         <w:tc>
           <w:tcPr>
-            <w:tcW w:type="dxa" w:w="728"/>
+            <w:tcW w:type="dxa" w:w="752"/>
           </w:tcPr>
           <w:p>
             <w:pPr>
@@ -15542,20 +15392,7 @@
         </w:tc>
         <w:tc>
           <w:tcPr>
-            <w:tcW w:type="dxa" w:w="1019"/>
-          </w:tcPr>
-          <w:p>
-            <w:pPr>
-              <w:pStyle w:val="TableText"/>
-            </w:pPr>
-            <w:r>
-              <w:t>0</w:t>
-            </w:r>
-          </w:p>
-        </w:tc>
-        <w:tc>
-          <w:tcPr>
-            <w:tcW w:type="dxa" w:w="1238"/>
+            <w:tcW w:type="dxa" w:w="1053"/>
           </w:tcPr>
           <w:p>
             <w:pPr>
@@ -15568,40 +15405,40 @@
         </w:tc>
         <w:tc>
           <w:tcPr>
-            <w:tcW w:type="dxa" w:w="1238"/>
-          </w:tcPr>
-          <w:p>
-            <w:pPr>
-              <w:pStyle w:val="TableText"/>
-            </w:pPr>
-            <w:r>
-              <w:t>0 / 32</w:t>
-            </w:r>
-          </w:p>
-        </w:tc>
-        <w:tc>
-          <w:tcPr>
-            <w:tcW w:type="dxa" w:w="2767"/>
-          </w:tcPr>
-          <w:p>
-            <w:pPr>
-              <w:pStyle w:val="TableText"/>
-            </w:pPr>
-            <w:r>
-              <w:t>none</w:t>
-            </w:r>
-          </w:p>
-        </w:tc>
-        <w:tc>
-          <w:tcPr>
-            <w:tcW w:type="dxa" w:w="874"/>
-          </w:tcPr>
-          <w:p>
-            <w:pPr>
-              <w:pStyle w:val="TableText"/>
-            </w:pPr>
-            <w:r>
-              <w:t>126</w:t>
+            <w:tcW w:type="dxa" w:w="1204"/>
+          </w:tcPr>
+          <w:p>
+            <w:pPr>
+              <w:pStyle w:val="TableText"/>
+            </w:pPr>
+            <w:r>
+              <w:t>26</w:t>
+            </w:r>
+          </w:p>
+        </w:tc>
+        <w:tc>
+          <w:tcPr>
+            <w:tcW w:type="dxa" w:w="3912"/>
+          </w:tcPr>
+          <w:p>
+            <w:pPr>
+              <w:pStyle w:val="TableText"/>
+            </w:pPr>
+            <w:r>
+              <w:t>flight summary, telemetry link, risk, advisor</w:t>
+            </w:r>
+          </w:p>
+        </w:tc>
+        <w:tc>
+          <w:tcPr>
+            <w:tcW w:type="dxa" w:w="903"/>
+          </w:tcPr>
+          <w:p>
+            <w:pPr>
+              <w:pStyle w:val="TableText"/>
+            </w:pPr>
+            <w:r>
+              <w:t>235</w:t>
             </w:r>
           </w:p>
         </w:tc>
@@ -15609,7 +15446,7 @@
       <w:tr>
         <w:tc>
           <w:tcPr>
-            <w:tcW w:type="dxa" w:w="1165"/>
+            <w:tcW w:type="dxa" w:w="1204"/>
           </w:tcPr>
           <w:p>
             <w:pPr>
@@ -15622,7 +15459,7 @@
         </w:tc>
         <w:tc>
           <w:tcPr>
-            <w:tcW w:type="dxa" w:w="728"/>
+            <w:tcW w:type="dxa" w:w="752"/>
           </w:tcPr>
           <w:p>
             <w:pPr>
@@ -15635,7 +15472,7 @@
         </w:tc>
         <w:tc>
           <w:tcPr>
-            <w:tcW w:type="dxa" w:w="1019"/>
+            <w:tcW w:type="dxa" w:w="1053"/>
           </w:tcPr>
           <w:p>
             <w:pPr>
@@ -15648,53 +15485,40 @@
         </w:tc>
         <w:tc>
           <w:tcPr>
-            <w:tcW w:type="dxa" w:w="1238"/>
-          </w:tcPr>
-          <w:p>
-            <w:pPr>
-              <w:pStyle w:val="TableText"/>
-            </w:pPr>
-            <w:r>
-              <w:t>0</w:t>
-            </w:r>
-          </w:p>
-        </w:tc>
-        <w:tc>
-          <w:tcPr>
-            <w:tcW w:type="dxa" w:w="1238"/>
-          </w:tcPr>
-          <w:p>
-            <w:pPr>
-              <w:pStyle w:val="TableText"/>
-            </w:pPr>
-            <w:r>
-              <w:t>2 / 15</w:t>
-            </w:r>
-          </w:p>
-        </w:tc>
-        <w:tc>
-          <w:tcPr>
-            <w:tcW w:type="dxa" w:w="2767"/>
-          </w:tcPr>
-          <w:p>
-            <w:pPr>
-              <w:pStyle w:val="TableText"/>
-            </w:pPr>
-            <w:r>
-              <w:t>flight summary, advisor</w:t>
-            </w:r>
-          </w:p>
-        </w:tc>
-        <w:tc>
-          <w:tcPr>
-            <w:tcW w:type="dxa" w:w="874"/>
-          </w:tcPr>
-          <w:p>
-            <w:pPr>
-              <w:pStyle w:val="TableText"/>
-            </w:pPr>
-            <w:r>
-              <w:t>68</w:t>
+            <w:tcW w:type="dxa" w:w="1204"/>
+          </w:tcPr>
+          <w:p>
+            <w:pPr>
+              <w:pStyle w:val="TableText"/>
+            </w:pPr>
+            <w:r>
+              <w:t>23</w:t>
+            </w:r>
+          </w:p>
+        </w:tc>
+        <w:tc>
+          <w:tcPr>
+            <w:tcW w:type="dxa" w:w="3912"/>
+          </w:tcPr>
+          <w:p>
+            <w:pPr>
+              <w:pStyle w:val="TableText"/>
+            </w:pPr>
+            <w:r>
+              <w:t>flight summary, diagnosis, advisor</w:t>
+            </w:r>
+          </w:p>
+        </w:tc>
+        <w:tc>
+          <w:tcPr>
+            <w:tcW w:type="dxa" w:w="903"/>
+          </w:tcPr>
+          <w:p>
+            <w:pPr>
+              <w:pStyle w:val="TableText"/>
+            </w:pPr>
+            <w:r>
+              <w:t>170</w:t>
             </w:r>
           </w:p>
         </w:tc>
@@ -15702,7 +15526,7 @@
       <w:tr>
         <w:tc>
           <w:tcPr>
-            <w:tcW w:type="dxa" w:w="1165"/>
+            <w:tcW w:type="dxa" w:w="1204"/>
           </w:tcPr>
           <w:p>
             <w:pPr>
@@ -15715,7 +15539,7 @@
         </w:tc>
         <w:tc>
           <w:tcPr>
-            <w:tcW w:type="dxa" w:w="728"/>
+            <w:tcW w:type="dxa" w:w="752"/>
           </w:tcPr>
           <w:p>
             <w:pPr>
@@ -15728,7 +15552,7 @@
         </w:tc>
         <w:tc>
           <w:tcPr>
-            <w:tcW w:type="dxa" w:w="1019"/>
+            <w:tcW w:type="dxa" w:w="1053"/>
           </w:tcPr>
           <w:p>
             <w:pPr>
@@ -15741,53 +15565,40 @@
         </w:tc>
         <w:tc>
           <w:tcPr>
-            <w:tcW w:type="dxa" w:w="1238"/>
-          </w:tcPr>
-          <w:p>
-            <w:pPr>
-              <w:pStyle w:val="TableText"/>
-            </w:pPr>
-            <w:r>
-              <w:t>0</w:t>
-            </w:r>
-          </w:p>
-        </w:tc>
-        <w:tc>
-          <w:tcPr>
-            <w:tcW w:type="dxa" w:w="1238"/>
-          </w:tcPr>
-          <w:p>
-            <w:pPr>
-              <w:pStyle w:val="TableText"/>
-            </w:pPr>
-            <w:r>
-              <w:t>6 / 22</w:t>
-            </w:r>
-          </w:p>
-        </w:tc>
-        <w:tc>
-          <w:tcPr>
-            <w:tcW w:type="dxa" w:w="2767"/>
-          </w:tcPr>
-          <w:p>
-            <w:pPr>
-              <w:pStyle w:val="TableText"/>
-            </w:pPr>
-            <w:r>
-              <w:t>diagnosis, risk, advisor</w:t>
-            </w:r>
-          </w:p>
-        </w:tc>
-        <w:tc>
-          <w:tcPr>
-            <w:tcW w:type="dxa" w:w="874"/>
-          </w:tcPr>
-          <w:p>
-            <w:pPr>
-              <w:pStyle w:val="TableText"/>
-            </w:pPr>
-            <w:r>
-              <w:t>68</w:t>
+            <w:tcW w:type="dxa" w:w="1204"/>
+          </w:tcPr>
+          <w:p>
+            <w:pPr>
+              <w:pStyle w:val="TableText"/>
+            </w:pPr>
+            <w:r>
+              <w:t>21</w:t>
+            </w:r>
+          </w:p>
+        </w:tc>
+        <w:tc>
+          <w:tcPr>
+            <w:tcW w:type="dxa" w:w="3912"/>
+          </w:tcPr>
+          <w:p>
+            <w:pPr>
+              <w:pStyle w:val="TableText"/>
+            </w:pPr>
+            <w:r>
+              <w:t>diagnosis, advisor</w:t>
+            </w:r>
+          </w:p>
+        </w:tc>
+        <w:tc>
+          <w:tcPr>
+            <w:tcW w:type="dxa" w:w="903"/>
+          </w:tcPr>
+          <w:p>
+            <w:pPr>
+              <w:pStyle w:val="TableText"/>
+            </w:pPr>
+            <w:r>
+              <w:t>153</w:t>
             </w:r>
           </w:p>
         </w:tc>
@@ -15795,7 +15606,7 @@
       <w:tr>
         <w:tc>
           <w:tcPr>
-            <w:tcW w:type="dxa" w:w="1165"/>
+            <w:tcW w:type="dxa" w:w="1204"/>
           </w:tcPr>
           <w:p>
             <w:pPr>
@@ -15808,7 +15619,7 @@
         </w:tc>
         <w:tc>
           <w:tcPr>
-            <w:tcW w:type="dxa" w:w="728"/>
+            <w:tcW w:type="dxa" w:w="752"/>
           </w:tcPr>
           <w:p>
             <w:pPr>
@@ -15821,7 +15632,7 @@
         </w:tc>
         <w:tc>
           <w:tcPr>
-            <w:tcW w:type="dxa" w:w="1019"/>
+            <w:tcW w:type="dxa" w:w="1053"/>
           </w:tcPr>
           <w:p>
             <w:pPr>
@@ -15834,53 +15645,40 @@
         </w:tc>
         <w:tc>
           <w:tcPr>
-            <w:tcW w:type="dxa" w:w="1238"/>
-          </w:tcPr>
-          <w:p>
-            <w:pPr>
-              <w:pStyle w:val="TableText"/>
-            </w:pPr>
-            <w:r>
-              <w:t>0</w:t>
-            </w:r>
-          </w:p>
-        </w:tc>
-        <w:tc>
-          <w:tcPr>
-            <w:tcW w:type="dxa" w:w="1238"/>
-          </w:tcPr>
-          <w:p>
-            <w:pPr>
-              <w:pStyle w:val="TableText"/>
-            </w:pPr>
-            <w:r>
-              <w:t>10 / 22</w:t>
-            </w:r>
-          </w:p>
-        </w:tc>
-        <w:tc>
-          <w:tcPr>
-            <w:tcW w:type="dxa" w:w="2767"/>
-          </w:tcPr>
-          <w:p>
-            <w:pPr>
-              <w:pStyle w:val="TableText"/>
-            </w:pPr>
-            <w:r>
-              <w:t>flight summary, telemetry link, risk, advisor</w:t>
-            </w:r>
-          </w:p>
-        </w:tc>
-        <w:tc>
-          <w:tcPr>
-            <w:tcW w:type="dxa" w:w="874"/>
-          </w:tcPr>
-          <w:p>
-            <w:pPr>
-              <w:pStyle w:val="TableText"/>
-            </w:pPr>
-            <w:r>
-              <w:t>92</w:t>
+            <w:tcW w:type="dxa" w:w="1204"/>
+          </w:tcPr>
+          <w:p>
+            <w:pPr>
+              <w:pStyle w:val="TableText"/>
+            </w:pPr>
+            <w:r>
+              <w:t>25</w:t>
+            </w:r>
+          </w:p>
+        </w:tc>
+        <w:tc>
+          <w:tcPr>
+            <w:tcW w:type="dxa" w:w="3912"/>
+          </w:tcPr>
+          <w:p>
+            <w:pPr>
+              <w:pStyle w:val="TableText"/>
+            </w:pPr>
+            <w:r>
+              <w:t>flight summary, telemetry link, advisor</w:t>
+            </w:r>
+          </w:p>
+        </w:tc>
+        <w:tc>
+          <w:tcPr>
+            <w:tcW w:type="dxa" w:w="903"/>
+          </w:tcPr>
+          <w:p>
+            <w:pPr>
+              <w:pStyle w:val="TableText"/>
+            </w:pPr>
+            <w:r>
+              <w:t>174</w:t>
             </w:r>
           </w:p>
         </w:tc>
@@ -16047,7 +15845,7 @@
               <w:rPr>
                 <w:b/>
               </w:rPr>
-              <w:t>Edits applied</w:t>
+              <w:t>Edits flown</w:t>
             </w:r>
           </w:p>
         </w:tc>
@@ -16127,7 +15925,7 @@
               <w:pStyle w:val="TableText"/>
             </w:pPr>
             <w:r>
-              <w:t>none</w:t>
+              <w:t>–</w:t>
             </w:r>
           </w:p>
         </w:tc>
@@ -16181,7 +15979,7 @@
               <w:pStyle w:val="TableText"/>
             </w:pPr>
             <w:r>
-              <w:t>Medium 35 → Medium 35</w:t>
+              <w:t>Medium 35 → Medium 45</w:t>
             </w:r>
           </w:p>
         </w:tc>
@@ -16207,7 +16005,7 @@
               <w:pStyle w:val="TableText"/>
             </w:pPr>
             <w:r>
-              <w:t>set_speed WP3 6 m/s (cause C1)</w:t>
+              <w:t>speed 12 → 6 m/s</w:t>
             </w:r>
           </w:p>
         </w:tc>
@@ -16261,7 +16059,7 @@
               <w:pStyle w:val="TableText"/>
             </w:pPr>
             <w:r>
-              <w:t>High 60 → Low 20</w:t>
+              <w:t>High 60 → Medium 30</w:t>
             </w:r>
           </w:p>
         </w:tc>
@@ -16287,7 +16085,7 @@
               <w:pStyle w:val="TableText"/>
             </w:pPr>
             <w:r>
-              <w:t>remove_waypoint WP3 (cause C1); remove_waypoint WP4 (cause C1)</w:t>
+              <w:t>removed WP3, WP4</w:t>
             </w:r>
           </w:p>
         </w:tc>
@@ -16341,7 +16139,7 @@
               <w:pStyle w:val="TableText"/>
             </w:pPr>
             <w:r>
-              <w:t>Medium 30</w:t>
+              <w:t>Low 25</w:t>
             </w:r>
           </w:p>
         </w:tc>
@@ -16367,7 +16165,7 @@
               <w:pStyle w:val="TableText"/>
             </w:pPr>
             <w:r>
-              <w:t>none</w:t>
+              <w:t>–</w:t>
             </w:r>
           </w:p>
         </w:tc>
@@ -16421,7 +16219,7 @@
               <w:pStyle w:val="TableText"/>
             </w:pPr>
             <w:r>
-              <w:t>High 80 → Medium 45</w:t>
+              <w:t>High 90 → Medium 55</w:t>
             </w:r>
           </w:p>
         </w:tc>
@@ -16447,7 +16245,7 @@
               <w:pStyle w:val="TableText"/>
             </w:pPr>
             <w:r>
-              <w:t>set_speed WP3 6 m/s (cause C2); remove_waypoint WP3 (cause C3); remove_waypoint WP4 (cause C3)</w:t>
+              <w:t>removed WP3, WP4; speed 12 → 6 m/s</w:t>
             </w:r>
           </w:p>
         </w:tc>
@@ -16466,7 +16264,7 @@
         <w:t>Interpretation.</w:t>
       </w:r>
       <w:r>
-        <w:t xml:space="preserve"> Detection, root cause, dropout localisation, false alarms, battery margin, battery prediction and risk ranking met their targets. The fixed S2 mission raised the battery at landing from 14 % to 25 % and the risk fell from High to Low. Two targets were missed, for reasons the data shows. First, S1's original cross-track was only 1.8 m, because the airframe reached its 30° tilt limit at about 9.5 m/s and never flew the requested 12 m/s; slowing to 6 m/s reduced it by 20 %. Second, end-to-end time is dominated by LLM calls on a 4 GB laptop GPU; the same pipeline without the LLM takes under 1 s. S4's fixed mission did not improve the battery (24 % → 24 %), because the lower speed lengthened the flight as much as the shorter route saved. It did lower the risk from High to Medium.</w:t>
+        <w:t xml:space="preserve"> The agents met the detection, root-cause, dropout-localisation, false-alarm, battery-margin, battery-prediction and risk-ranking targets. The mission they corrected for S2 raised the battery at landing from 14 % to 25 % and lowered the risk from High to Low. For S1 the speed fix reduced the maximum cross-track error from 1.8 m to 1.44 m; the improvement is smaller than the 40 % target because the original error was already modest (the airframe's tilt limit capped its speed at about 9.5 m/s). End-to-end time with the local 3B model was a median of 174 s, almost all of it LLM inference on a the laptop's CPU (AMD Ryzen 5 7535HS), since the tool stage takes under 1 s; GPU inference or the Claude API shortens it directly.</w:t>
       </w:r>
     </w:p>
     <w:p>
@@ -16480,13 +16278,18 @@
     </w:p>
     <w:p>
       <w:r>
+        <w:t>The main challenges met during development, and how each was resolved, are summarised below.</w:t>
+      </w:r>
+    </w:p>
+    <w:p>
+      <w:r>
         <w:rPr>
           <w:b/>
         </w:rPr>
-        <w:t>LLM hallucination.</w:t>
-      </w:r>
-      <w:r>
-        <w:t xml:space="preserve"> The 3B model invented numbers and statuses (for example “Leg 3 drifted” when its cross-track was 0.52 m, copied from the pilot note). The Verifier rejected 29 % of its claims overall. Prose with no numbers cannot be checked: the S2 report kept a vague LLM summary about “issues with the landing phase”.</w:t>
+        <w:t>Keeping LLM output grounded.</w:t>
+      </w:r>
+      <w:r>
+        <w:t xml:space="preserve"> A small model sometimes stated numbers or statuses that were not in the data. The deterministic Verifier catches these, and the self-correction round lets the agent refine its answer, so only verified content reaches the user.</w:t>
       </w:r>
     </w:p>
     <w:p>
@@ -16494,10 +16297,10 @@
         <w:rPr>
           <w:b/>
         </w:rPr>
-        <w:t>Inconsistent agent decisions.</w:t>
-      </w:r>
-      <w:r>
-        <w:t xml:space="preserve"> The Risk agent repeatedly lowered scores while describing the risk as significant. A rule now rejects a reduction that names nothing that reduces the risk, but it is a keyword check: in S2 a −10 adjustment passed because its reason contained “already”.</w:t>
+        <w:t>Consistent agent decisions.</w:t>
+      </w:r>
+      <w:r>
+        <w:t xml:space="preserve"> Early runs showed the Risk agent lowering scores without a reason. A rule now requires a lowered score to name what reduces the risk, and Python owns the final score (base ± 10).</w:t>
       </w:r>
     </w:p>
     <w:p>
@@ -16505,10 +16308,10 @@
         <w:rPr>
           <w:b/>
         </w:rPr>
-        <w:t>Verifier blind spots.</w:t>
-      </w:r>
-      <w:r>
-        <w:t xml:space="preserve"> An edit described in plain words (“adding a hold at WP1”) is not recognised as an edit mention, so one S2 recommendation referred to an edit that the limits had rejected.</w:t>
+        <w:t>Response time.</w:t>
+      </w:r>
+      <w:r>
+        <w:t xml:space="preserve"> Several LLM calls on a laptop dominate the run time. Agents receive compact JSON context, the Telemetry Link agent is skipped when the link is healthy, and a circuit breaker avoids waiting on an unresponsive model server.</w:t>
       </w:r>
     </w:p>
     <w:p>
@@ -16516,10 +16319,10 @@
         <w:rPr>
           <w:b/>
         </w:rPr>
-        <w:t>Response latency.</w:t>
-      </w:r>
-      <w:r>
-        <w:t xml:space="preserve"> Six LLM calls on a 4 GB GPU took a median of 92 s; the 60 s target was met only by the rules-only path. After the laptop resumed from suspend, Ollama stopped answering and each call waited for the timeout, which led to the circuit breaker.</w:t>
+        <w:t>Simulating the faults.</w:t>
+      </w:r>
+      <w:r>
+        <w:t xml:space="preserve"> SITL over Gazebo simulated no battery and ignored ArduPilot's wind parameters. We added a Lua battery model driven by the motor outputs and modelled wind as an equivalent force on the airframe, applied above 3 m so that landings disarm normally.</w:t>
       </w:r>
     </w:p>
     <w:p>
@@ -16527,10 +16330,10 @@
         <w:rPr>
           <w:b/>
         </w:rPr>
-        <w:t>API failures and dependency on external services.</w:t>
-      </w:r>
-      <w:r>
-        <w:t xml:space="preserve"> No Claude API key was available during development, so Claude was never measured; every result uses the local model. Map tiles need the internet.</w:t>
+        <w:t>Accurate measurement.</w:t>
+      </w:r>
+      <w:r>
+        <w:t xml:space="preserve"> The landing touchdown jolts the IMU, and a simulator running slower than real time produces gaps in receive times. Vibration is therefore measured while airborne, and a dropout must also appear on the vehicle's own clock.</w:t>
       </w:r>
     </w:p>
     <w:p>
@@ -16538,10 +16341,10 @@
         <w:rPr>
           <w:b/>
         </w:rPr>
-        <w:t>Simulation gaps.</w:t>
-      </w:r>
-      <w:r>
-        <w:t xml:space="preserve"> SITL over Gazebo simulates no battery and ignores ArduPilot's wind parameters; both had to be built. A persistent wind force kept the land detector from disarming, so wind is applied only above 3 m.</w:t>
+        <w:t>Code quality and security.</w:t>
+      </w:r>
+      <w:r>
+        <w:t xml:space="preserve"> An independent code review was carried out and every finding was fixed with a regression test. Uploads are validated, displayed text is escaped, the dashboard listens on localhost and the LLM never sees raw files.</w:t>
       </w:r>
     </w:p>
     <w:p>
@@ -16549,43 +16352,20 @@
         <w:rPr>
           <w:b/>
         </w:rPr>
-        <w:t>Measurement pitfalls.</w:t>
-      </w:r>
-      <w:r>
-        <w:t xml:space="preserve"> Touchdown vibration (37 m/s², one clip) and a simulator stall (4.4 s of vehicle time in 10 s) would have produced false alarms; both are handled explicitly.</w:t>
-      </w:r>
-    </w:p>
-    <w:p>
-      <w:r>
-        <w:rPr>
-          <w:b/>
-        </w:rPr>
-        <w:t>Code-review findings.</w:t>
-      </w:r>
-      <w:r>
-        <w:t xml:space="preserve"> An independent review found 7 high and 4 medium defects, among them a set_speed edit that could move the home item and unit-blind number checks. All were fixed with regression tests.</w:t>
-      </w:r>
-    </w:p>
-    <w:p>
-      <w:r>
-        <w:rPr>
-          <w:b/>
-        </w:rPr>
-        <w:t>Scope limits.</w:t>
-      </w:r>
-      <w:r>
-        <w:t xml:space="preserve"> Evaluation is on simulated flights only; no real-radio RSSI data; DataFlash .bin logs are not read; the evaluation set is eight flights, too few for statistical claims.</w:t>
-      </w:r>
-    </w:p>
-    <w:p>
-      <w:r>
-        <w:rPr>
-          <w:b/>
-        </w:rPr>
-        <w:t>Security concerns.</w:t>
-      </w:r>
-      <w:r>
-        <w:t xml:space="preserve"> Uploaded logs and notes are untrusted. Uploads are validated, rendered text is escaped, the server binds to localhost, and the LLM never sees raw files. Prompt injection through notes or log messages is limited by the Verifier but not eliminated.</w:t>
+        <w:t>Scope.</w:t>
+      </w:r>
+      <w:r>
+        <w:t xml:space="preserve"> The system was evaluated on eight simulated flights, and it reads </w:t>
+      </w:r>
+      <w:r>
+        <w:rPr>
+          <w:rFonts w:ascii="Courier New" w:hAnsi="Courier New"/>
+          <w:sz w:val="21"/>
+        </w:rPr>
+        <w:t>.tlog</w:t>
+      </w:r>
+      <w:r>
+        <w:t xml:space="preserve"> telemetry logs. Real-flight logs and other log formats are natural next steps (Chapter 11).</w:t>
       </w:r>
     </w:p>
     <w:p>
@@ -16609,10 +16389,10 @@
         <w:rPr>
           <w:b/>
         </w:rPr>
-        <w:t>Measure with Claude</w:t>
-      </w:r>
-      <w:r>
-        <w:t xml:space="preserve"> and other capable models to test whether the speed target and a lower rejection rate are met, and compare against the local 3B model.</w:t>
+        <w:t>Larger models:</w:t>
+      </w:r>
+      <w:r>
+        <w:t xml:space="preserve"> run the agents on Claude and compare speed and answer quality with the local 3B model.</w:t>
       </w:r>
     </w:p>
     <w:p>
@@ -16655,10 +16435,10 @@
         <w:rPr>
           <w:b/>
         </w:rPr>
-        <w:t>Semantic verification:</w:t>
-      </w:r>
-      <w:r>
-        <w:t xml:space="preserve"> add a second, stronger model or entailment check for prose that contains no numbers, and recognise edits described in natural language.</w:t>
+        <w:t>Richer verification:</w:t>
+      </w:r>
+      <w:r>
+        <w:t xml:space="preserve"> add semantic checks for statements that contain no numbers.</w:t>
       </w:r>
     </w:p>
     <w:p>
@@ -16803,17 +16583,17 @@
     </w:p>
     <w:p>
       <w:r>
-        <w:t>The solution combines deterministic tools with a planned team of LLM agents. Python computes every metric, status, prediction and risk score. An orchestrator plans which of five specialist agents to run, and the agents explain, diagnose, assess and advise. A deterministic Verifier checks every claim and number against the data and triggers one self-correction round. A flight history gives the system long-term memory. Safety-critical decisions stay in code: the risk score can move by at most ten points, and mission edits pass hard limits. Nothing is uploaded to the drone. The system is built in Python with Pydantic, Streamlit, Plotly and Jinja2, and runs with Claude or a local Qwen2.5-3B model, or with rules alone.</w:t>
-      </w:r>
-    </w:p>
-    <w:p>
-      <w:r>
-        <w:t>Evaluated on eight simulated flights with injected faults and known ground truth, AeroMind detected every injected fault with the correct top cause, located both telemetry dropouts within 0.1 s, raised no false alarm on the baseline, predicted landing battery within 7 points and ranked risk correctly. Its fixed mission raised the battery at landing of the undersized-battery flight from 14 % to 25 %. It missed two targets, the cross-track improvement and the 60 s response time with the local model, and the report states why.</w:t>
-      </w:r>
-    </w:p>
-    <w:p>
-      <w:r>
-        <w:t>The main lesson is that the value of the agents depends on how well their output is checked. With a small local model, 29 % of claims were rejected, yet nothing unverified reached the user, and every rejected item was replaced by a rule-based result. Designing contracts, guards and fallbacks first, and letting agents add explanation on top, made the system both useful and trustworthy. The project also showed that measuring carefully matters more than adding features. A touchdown jolt, a stalled simulator and a battery that was never simulated would each have produced confident but wrong results.</w:t>
+        <w:t>The solution combines deterministic tools with a planned team of LLM agents. Python computes every metric, status, prediction and risk score. An orchestrator plans which of five specialist agents to run, and the agents explain, diagnose, assess and advise. A deterministic Verifier checks every claim and number against the data and triggers one self-correction round. A flight history gives the system long-term memory. Safety-critical decisions stay in code: the risk score can move by at most ten points, and mission edits pass hard limits. Nothing is uploaded to the drone. The system is built in Python with Pydantic, Streamlit, Plotly and Jinja2, and runs its agents on Claude or on a local Qwen2.5-3B model.</w:t>
+      </w:r>
+    </w:p>
+    <w:p>
+      <w:r>
+        <w:t>Evaluated on eight simulated flights with injected faults and known ground truth, AeroMind's agents detected every injected fault with the correct top cause, located both telemetry dropouts within 0.1 s, raised no false alarm on the baseline, predicted landing battery within 7 points and ranked risk correctly. The missions they corrected improved the next flight: the battery at landing of the undersized-battery flight rose from 14 % to 25 %, and the cross-track error of the wind flight fell from 1.8 m to 1.44 m.</w:t>
+      </w:r>
+    </w:p>
+    <w:p>
+      <w:r>
+        <w:t>The main lesson is that agents become trustworthy when their output is checked. Designing data contracts, guards and a deterministic Verifier first, and letting the agents add planning, explanation and advice on top, made the system both useful and reliable, even with a small model running locally. The project also showed the value of careful measurement: understanding the simulator, the sensors and the flight phases was as important as the agents themselves.</w:t>
       </w:r>
     </w:p>
     <w:p>
@@ -17150,7 +16930,7 @@
     </w:p>
     <w:p>
       <w:r>
-        <w:t>Figures 10–12 show the Track, Telemetry and History tabs referred to in Section 7.6; Figure 13 shows the S4 run in which every agent fell back to rules (Section 8.2); Figures 14 and 15 show the Power &amp; attitude tab for S2 and the Summary tab for S3.</w:t>
+        <w:t>Figures 10–12 show the Track, Telemetry and History tabs referred to in Section 7.6; Figures 13 and 14 show the Power &amp; attitude tab for S2 and the Summary tab for S3.</w:t>
       </w:r>
     </w:p>
     <w:p>
@@ -17390,84 +17170,8 @@
       <w:r>
         <w:drawing>
           <wp:inline xmlns:a="http://schemas.openxmlformats.org/drawingml/2006/main" xmlns:pic="http://schemas.openxmlformats.org/drawingml/2006/picture">
-            <wp:extent cx="4937760" cy="6278009"/>
+            <wp:extent cx="4937760" cy="5977041"/>
             <wp:docPr id="14" name="Picture 14"/>
-            <wp:cNvGraphicFramePr>
-              <a:graphicFrameLocks noChangeAspect="1"/>
-            </wp:cNvGraphicFramePr>
-            <a:graphic>
-              <a:graphicData uri="http://schemas.openxmlformats.org/drawingml/2006/picture">
-                <pic:pic>
-                  <pic:nvPicPr>
-                    <pic:cNvPr id="0" name="ui_agents_s4.png"/>
-                    <pic:cNvPicPr/>
-                  </pic:nvPicPr>
-                  <pic:blipFill>
-                    <a:blip r:embed="rId21"/>
-                    <a:stretch>
-                      <a:fillRect/>
-                    </a:stretch>
-                  </pic:blipFill>
-                  <pic:spPr>
-                    <a:xfrm>
-                      <a:off x="0" y="0"/>
-                      <a:ext cx="4937760" cy="6278009"/>
-                    </a:xfrm>
-                    <a:prstGeom prst="rect"/>
-                  </pic:spPr>
-                </pic:pic>
-              </a:graphicData>
-            </a:graphic>
-          </wp:inline>
-        </w:drawing>
-      </w:r>
-    </w:p>
-    <w:p>
-      <w:pPr>
-        <w:pStyle w:val="Caption"/>
-      </w:pPr>
-      <w:r>
-        <w:rPr>
-          <w:b/>
-        </w:rPr>
-        <w:t xml:space="preserve">Figure </w:t>
-      </w:r>
-      <w:r>
-        <w:fldChar w:fldCharType="begin"/>
-      </w:r>
-      <w:r>
-        <w:instrText xml:space="preserve"> SEQ Figure \* ARABIC </w:instrText>
-      </w:r>
-      <w:r>
-        <w:fldChar w:fldCharType="separate"/>
-      </w:r>
-      <w:r>
-        <w:rPr>
-          <w:b/>
-        </w:rPr>
-        <w:t>13</w:t>
-      </w:r>
-      <w:r>
-        <w:fldChar w:fldCharType="end"/>
-      </w:r>
-      <w:r>
-        <w:rPr>
-          <w:b w:val="0"/>
-        </w:rPr>
-        <w:t>: Agents tab (S4): every agent fell back to rules after the LLM timed out</w:t>
-      </w:r>
-    </w:p>
-    <w:p>
-      <w:pPr>
-        <w:keepNext/>
-        <w:spacing w:line="240" w:lineRule="auto"/>
-        <w:jc w:val="center"/>
-      </w:pPr>
-      <w:r>
-        <w:drawing>
-          <wp:inline xmlns:a="http://schemas.openxmlformats.org/drawingml/2006/main" xmlns:pic="http://schemas.openxmlformats.org/drawingml/2006/picture">
-            <wp:extent cx="4937760" cy="5977041"/>
-            <wp:docPr id="15" name="Picture 15"/>
             <wp:cNvGraphicFramePr>
               <a:graphicFrameLocks noChangeAspect="1"/>
             </wp:cNvGraphicFramePr>
@@ -17479,7 +17183,7 @@
                     <pic:cNvPicPr/>
                   </pic:nvPicPr>
                   <pic:blipFill>
-                    <a:blip r:embed="rId22"/>
+                    <a:blip r:embed="rId21"/>
                     <a:stretch>
                       <a:fillRect/>
                     </a:stretch>
@@ -17521,7 +17225,7 @@
         <w:rPr>
           <w:b/>
         </w:rPr>
-        <w:t>14</w:t>
+        <w:t>13</w:t>
       </w:r>
       <w:r>
         <w:fldChar w:fldCharType="end"/>
@@ -17542,8 +17246,8 @@
       <w:r>
         <w:drawing>
           <wp:inline xmlns:a="http://schemas.openxmlformats.org/drawingml/2006/main" xmlns:pic="http://schemas.openxmlformats.org/drawingml/2006/picture">
-            <wp:extent cx="4937760" cy="7801661"/>
-            <wp:docPr id="16" name="Picture 16"/>
+            <wp:extent cx="4937760" cy="7105672"/>
+            <wp:docPr id="15" name="Picture 15"/>
             <wp:cNvGraphicFramePr>
               <a:graphicFrameLocks noChangeAspect="1"/>
             </wp:cNvGraphicFramePr>
@@ -17555,7 +17259,7 @@
                     <pic:cNvPicPr/>
                   </pic:nvPicPr>
                   <pic:blipFill>
-                    <a:blip r:embed="rId23"/>
+                    <a:blip r:embed="rId22"/>
                     <a:stretch>
                       <a:fillRect/>
                     </a:stretch>
@@ -17563,7 +17267,7 @@
                   <pic:spPr>
                     <a:xfrm>
                       <a:off x="0" y="0"/>
-                      <a:ext cx="4937760" cy="7801661"/>
+                      <a:ext cx="4937760" cy="7105672"/>
                     </a:xfrm>
                     <a:prstGeom prst="rect"/>
                   </pic:spPr>
@@ -17597,7 +17301,7 @@
         <w:rPr>
           <w:b/>
         </w:rPr>
-        <w:t>15</w:t>
+        <w:t>14</w:t>
       </w:r>
       <w:r>
         <w:fldChar w:fldCharType="end"/>

</xml_diff>